<commit_message>
svm and random forest in report
</commit_message>
<xml_diff>
--- a/Phase 3/Pilot Study.docx
+++ b/Phase 3/Pilot Study.docx
@@ -2138,15 +2138,7 @@
           <w:bCs w:val="0"/>
           <w14:ligatures w14:val="standard"/>
         </w:rPr>
-        <w:t>. Same performance metrics as before.</w:t>
-      </w:r>
-      <w:r>
-        <w:rPr>
-          <w:b w:val="0"/>
-          <w:bCs w:val="0"/>
-          <w14:ligatures w14:val="standard"/>
-        </w:rPr>
-        <w:t xml:space="preserve"> We tried 5 different values of N: square root number of rows, log number of rows, 243, 300 and 200. The results are:</w:t>
+        <w:t>. Same performance metrics as before. We tried 5 different values of N: square root number of rows, log number of rows, 243, 300 and 200. The results are:</w:t>
       </w:r>
     </w:p>
     <w:p>
@@ -2155,6 +2147,9 @@
         <w:ind w:left="720" w:hanging="360"/>
       </w:pPr>
       <w:r>
+        <w:rPr>
+          <w:noProof/>
+        </w:rPr>
         <w:drawing>
           <wp:inline distT="0" distB="0" distL="0" distR="0" wp14:anchorId="616122AD" wp14:editId="321B6AA6">
             <wp:extent cx="2959100" cy="760730"/>
@@ -2240,6 +2235,7 @@
       </w:pPr>
       <w:r>
         <w:rPr>
+          <w:noProof/>
           <w:lang w:val="en-US"/>
         </w:rPr>
         <w:drawing>
@@ -2327,6 +2323,7 @@
       </w:pPr>
       <w:r>
         <w:rPr>
+          <w:noProof/>
           <w:lang w:val="en-US"/>
         </w:rPr>
         <w:drawing>
@@ -2414,6 +2411,7 @@
       </w:pPr>
       <w:r>
         <w:rPr>
+          <w:noProof/>
           <w:lang w:val="en-US"/>
         </w:rPr>
         <w:drawing>
@@ -2501,6 +2499,7 @@
       </w:pPr>
       <w:r>
         <w:rPr>
+          <w:noProof/>
           <w:lang w:val="en-US"/>
         </w:rPr>
         <w:drawing>
@@ -2594,6 +2593,327 @@
         </w:rPr>
         <w:t>This also seems like a model that is too cautious when classifying if a person has diabetes or not, corroborated by the 0.61 precision. The log model has the best F1 score out of them, but has also the worse average AUC.</w:t>
       </w:r>
+    </w:p>
+    <w:p>
+      <w:pPr>
+        <w:rPr>
+          <w:lang w:val="en-US"/>
+        </w:rPr>
+      </w:pPr>
+    </w:p>
+    <w:p>
+      <w:pPr>
+        <w:pStyle w:val="ListParagraph"/>
+      </w:pPr>
+      <w:r>
+        <w:t>Random Forest</w:t>
+      </w:r>
+    </w:p>
+    <w:p>
+      <w:pPr>
+        <w:ind w:left="360"/>
+        <w:rPr>
+          <w:sz w:val="20"/>
+          <w:szCs w:val="24"/>
+        </w:rPr>
+      </w:pPr>
+      <w:r>
+        <w:rPr>
+          <w:sz w:val="20"/>
+          <w:szCs w:val="24"/>
+        </w:rPr>
+        <w:t>We used the random forest classifier from sklearn with</w:t>
+      </w:r>
+      <w:r>
+        <w:rPr>
+          <w:sz w:val="20"/>
+          <w:szCs w:val="24"/>
+        </w:rPr>
+        <w:t xml:space="preserve"> 10-fold cross validation to account</w:t>
+      </w:r>
+      <w:r>
+        <w:rPr>
+          <w:sz w:val="20"/>
+          <w:szCs w:val="24"/>
+        </w:rPr>
+        <w:t xml:space="preserve"> for different training-test splits. It performed</w:t>
+      </w:r>
+      <w:r>
+        <w:rPr>
+          <w:sz w:val="20"/>
+          <w:szCs w:val="24"/>
+        </w:rPr>
+        <w:t xml:space="preserve"> decently well </w:t>
+      </w:r>
+      <w:r>
+        <w:rPr>
+          <w:sz w:val="20"/>
+          <w:szCs w:val="24"/>
+        </w:rPr>
+        <w:t xml:space="preserve">in terms of recall and F1-score for non-diabetics, but when it came to diabetics, the </w:t>
+      </w:r>
+      <w:r>
+        <w:rPr>
+          <w:sz w:val="20"/>
+          <w:szCs w:val="24"/>
+        </w:rPr>
+        <w:t>model was only able to detect 19% of all diabetics with a precision of</w:t>
+      </w:r>
+      <w:r>
+        <w:rPr>
+          <w:sz w:val="20"/>
+          <w:szCs w:val="24"/>
+        </w:rPr>
+        <w:t xml:space="preserve"> 55%. These measures are better than other options, but not the best around since not </w:t>
+      </w:r>
+      <w:r>
+        <w:rPr>
+          <w:sz w:val="20"/>
+          <w:szCs w:val="24"/>
+        </w:rPr>
+        <w:t>enough positive predictions are made and half of those predictions are false positives.</w:t>
+      </w:r>
+    </w:p>
+    <w:p/>
+    <w:p>
+      <w:pPr>
+        <w:rPr>
+          <w:lang w:val="en-US"/>
+        </w:rPr>
+      </w:pPr>
+      <w:r>
+        <w:rPr>
+          <w:lang w:val="en-US"/>
+        </w:rPr>
+        <w:drawing>
+          <wp:inline distT="0" distB="0" distL="0" distR="0" wp14:anchorId="75FFF4B7" wp14:editId="0608E74C">
+            <wp:extent cx="3048000" cy="697230"/>
+            <wp:effectExtent l="0" t="0" r="0" b="7620"/>
+            <wp:docPr id="463132887" name="Picture 1"/>
+            <wp:cNvGraphicFramePr>
+              <a:graphicFrameLocks xmlns:a="http://schemas.openxmlformats.org/drawingml/2006/main" noChangeAspect="1"/>
+            </wp:cNvGraphicFramePr>
+            <a:graphic xmlns:a="http://schemas.openxmlformats.org/drawingml/2006/main">
+              <a:graphicData uri="http://schemas.openxmlformats.org/drawingml/2006/picture">
+                <pic:pic xmlns:pic="http://schemas.openxmlformats.org/drawingml/2006/picture">
+                  <pic:nvPicPr>
+                    <pic:cNvPr id="463132887" name=""/>
+                    <pic:cNvPicPr/>
+                  </pic:nvPicPr>
+                  <pic:blipFill>
+                    <a:blip r:embed="rId31"/>
+                    <a:stretch>
+                      <a:fillRect/>
+                    </a:stretch>
+                  </pic:blipFill>
+                  <pic:spPr>
+                    <a:xfrm>
+                      <a:off x="0" y="0"/>
+                      <a:ext cx="3048000" cy="697230"/>
+                    </a:xfrm>
+                    <a:prstGeom prst="rect">
+                      <a:avLst/>
+                    </a:prstGeom>
+                  </pic:spPr>
+                </pic:pic>
+              </a:graphicData>
+            </a:graphic>
+          </wp:inline>
+        </w:drawing>
+      </w:r>
+    </w:p>
+    <w:p>
+      <w:pPr>
+        <w:pStyle w:val="Caption"/>
+        <w:rPr>
+          <w:lang w:val="en-US"/>
+        </w:rPr>
+      </w:pPr>
+      <w:r>
+        <w:t>Figure 19</w:t>
+      </w:r>
+    </w:p>
+    <w:p>
+      <w:pPr>
+        <w:rPr>
+          <w:lang w:val="en-US"/>
+        </w:rPr>
+      </w:pPr>
+    </w:p>
+    <w:p>
+      <w:pPr>
+        <w:pStyle w:val="ListParagraph"/>
+      </w:pPr>
+      <w:r>
+        <w:t>SVM</w:t>
+      </w:r>
+    </w:p>
+    <w:p>
+      <w:pPr>
+        <w:ind w:left="360"/>
+        <w:rPr>
+          <w:sz w:val="20"/>
+          <w:szCs w:val="24"/>
+        </w:rPr>
+      </w:pPr>
+      <w:r>
+        <w:rPr>
+          <w:sz w:val="20"/>
+          <w:szCs w:val="24"/>
+        </w:rPr>
+        <w:lastRenderedPageBreak/>
+        <w:t xml:space="preserve">We used </w:t>
+      </w:r>
+      <w:r>
+        <w:rPr>
+          <w:sz w:val="20"/>
+          <w:szCs w:val="24"/>
+        </w:rPr>
+        <w:t>the SVM classifier from sklearn and specifically used</w:t>
+      </w:r>
+      <w:r>
+        <w:rPr>
+          <w:sz w:val="20"/>
+          <w:szCs w:val="24"/>
+        </w:rPr>
+        <w:t xml:space="preserve"> the rbf kernel. The linear kernel was used for a trial, but </w:t>
+      </w:r>
+      <w:r>
+        <w:rPr>
+          <w:sz w:val="20"/>
+          <w:szCs w:val="24"/>
+        </w:rPr>
+        <w:t>the run was so long</w:t>
+      </w:r>
+      <w:r>
+        <w:rPr>
+          <w:sz w:val="20"/>
+          <w:szCs w:val="24"/>
+        </w:rPr>
+        <w:t xml:space="preserve"> that it was impractical. Therefore, we used the rbf kernel with</w:t>
+      </w:r>
+      <w:r>
+        <w:rPr>
+          <w:sz w:val="20"/>
+          <w:szCs w:val="24"/>
+        </w:rPr>
+        <w:t xml:space="preserve"> 10-fold cross</w:t>
+      </w:r>
+      <w:r>
+        <w:rPr>
+          <w:sz w:val="20"/>
+          <w:szCs w:val="24"/>
+        </w:rPr>
+        <w:t xml:space="preserve"> validation to increase the reliability of the results. The performance metrics are the same</w:t>
+      </w:r>
+      <w:r>
+        <w:rPr>
+          <w:sz w:val="20"/>
+          <w:szCs w:val="24"/>
+        </w:rPr>
+        <w:t xml:space="preserve"> as most models, but AUC is removed because turning the probability setting to true in the </w:t>
+      </w:r>
+      <w:r>
+        <w:rPr>
+          <w:sz w:val="20"/>
+          <w:szCs w:val="24"/>
+        </w:rPr>
+        <w:t>model takes way too much time.</w:t>
+      </w:r>
+      <w:r>
+        <w:rPr>
+          <w:sz w:val="20"/>
+          <w:szCs w:val="24"/>
+        </w:rPr>
+        <w:t xml:space="preserve"> It has a higher than average precision with diabetics (but lower than average for non-diabetics)</w:t>
+      </w:r>
+      <w:r>
+        <w:rPr>
+          <w:sz w:val="20"/>
+          <w:szCs w:val="24"/>
+        </w:rPr>
+        <w:t>. In contrast, the recall and F1-score for non-diabetics implies a level overfitting</w:t>
+      </w:r>
+      <w:r>
+        <w:rPr>
+          <w:sz w:val="20"/>
+          <w:szCs w:val="24"/>
+        </w:rPr>
+        <w:t xml:space="preserve"> with not enough diabetics being detected by the model.</w:t>
+      </w:r>
+    </w:p>
+    <w:p>
+      <w:pPr>
+        <w:ind w:left="360"/>
+        <w:rPr>
+          <w:sz w:val="20"/>
+          <w:szCs w:val="24"/>
+        </w:rPr>
+      </w:pPr>
+      <w:r>
+        <w:rPr>
+          <w:sz w:val="20"/>
+          <w:szCs w:val="24"/>
+        </w:rPr>
+        <w:drawing>
+          <wp:inline distT="0" distB="0" distL="0" distR="0" wp14:anchorId="5399F011" wp14:editId="64E3E6BC">
+            <wp:extent cx="3048000" cy="878840"/>
+            <wp:effectExtent l="0" t="0" r="0" b="0"/>
+            <wp:docPr id="1559188133" name="Picture 1" descr="A screenshot of a graph&#10;&#10;AI-generated content may be incorrect."/>
+            <wp:cNvGraphicFramePr>
+              <a:graphicFrameLocks xmlns:a="http://schemas.openxmlformats.org/drawingml/2006/main" noChangeAspect="1"/>
+            </wp:cNvGraphicFramePr>
+            <a:graphic xmlns:a="http://schemas.openxmlformats.org/drawingml/2006/main">
+              <a:graphicData uri="http://schemas.openxmlformats.org/drawingml/2006/picture">
+                <pic:pic xmlns:pic="http://schemas.openxmlformats.org/drawingml/2006/picture">
+                  <pic:nvPicPr>
+                    <pic:cNvPr id="1559188133" name="Picture 1" descr="A screenshot of a graph&#10;&#10;AI-generated content may be incorrect."/>
+                    <pic:cNvPicPr/>
+                  </pic:nvPicPr>
+                  <pic:blipFill>
+                    <a:blip r:embed="rId32"/>
+                    <a:stretch>
+                      <a:fillRect/>
+                    </a:stretch>
+                  </pic:blipFill>
+                  <pic:spPr>
+                    <a:xfrm>
+                      <a:off x="0" y="0"/>
+                      <a:ext cx="3048000" cy="878840"/>
+                    </a:xfrm>
+                    <a:prstGeom prst="rect">
+                      <a:avLst/>
+                    </a:prstGeom>
+                  </pic:spPr>
+                </pic:pic>
+              </a:graphicData>
+            </a:graphic>
+          </wp:inline>
+        </w:drawing>
+      </w:r>
+    </w:p>
+    <w:p>
+      <w:pPr>
+        <w:pStyle w:val="Caption"/>
+        <w:rPr>
+          <w:lang w:val="en-US"/>
+        </w:rPr>
+      </w:pPr>
+      <w:r>
+        <w:t xml:space="preserve">Figure </w:t>
+      </w:r>
+      <w:r>
+        <w:t>19</w:t>
+      </w:r>
+    </w:p>
+    <w:p>
+      <w:pPr>
+        <w:ind w:left="360"/>
+        <w:rPr>
+          <w:sz w:val="20"/>
+          <w:szCs w:val="24"/>
+        </w:rPr>
+      </w:pPr>
     </w:p>
     <w:sectPr>
       <w:endnotePr>
@@ -11499,10 +11819,6 @@
 </file>
 
 <file path=customXml/item1.xml><?xml version="1.0" encoding="utf-8"?>
-<b:Sources xmlns:b="http://schemas.openxmlformats.org/officeDocument/2006/bibliography" xmlns="http://schemas.openxmlformats.org/officeDocument/2006/bibliography" SelectedStyle="\APA.XSL" StyleName="APA"/>
-</file>
-
-<file path=customXml/item2.xml><?xml version="1.0" encoding="utf-8"?>
 <Workflow version="v.1.13">
   <Filtration versionrequired="True" status="DONE" StartTime="25-07-2014 13:27:04" EndTime="25-07-2014 13:28:29">
     <Mandatory>
@@ -11680,16 +11996,20 @@
 </Workflow>
 </file>
 
+<file path=customXml/item2.xml><?xml version="1.0" encoding="utf-8"?>
+<b:Sources xmlns:b="http://schemas.openxmlformats.org/officeDocument/2006/bibliography" xmlns="http://schemas.openxmlformats.org/officeDocument/2006/bibliography" SelectedStyle="\APA.XSL" StyleName="APA"/>
+</file>
+
 <file path=customXml/itemProps1.xml><?xml version="1.0" encoding="utf-8"?>
+<ds:datastoreItem xmlns:ds="http://schemas.openxmlformats.org/officeDocument/2006/customXml" ds:itemID="{4D45DBA2-DCF6-46BF-858B-9A8CC8161B4D}">
+  <ds:schemaRefs/>
+</ds:datastoreItem>
+</file>
+
+<file path=customXml/itemProps2.xml><?xml version="1.0" encoding="utf-8"?>
 <ds:datastoreItem xmlns:ds="http://schemas.openxmlformats.org/officeDocument/2006/customXml" ds:itemID="{B589180B-96F4-4B3D-93D7-E2C64345EF74}">
   <ds:schemaRefs>
     <ds:schemaRef ds:uri="http://schemas.openxmlformats.org/officeDocument/2006/bibliography"/>
   </ds:schemaRefs>
 </ds:datastoreItem>
-</file>
-
-<file path=customXml/itemProps2.xml><?xml version="1.0" encoding="utf-8"?>
-<ds:datastoreItem xmlns:ds="http://schemas.openxmlformats.org/officeDocument/2006/customXml" ds:itemID="{4D45DBA2-DCF6-46BF-858B-9A8CC8161B4D}">
-  <ds:schemaRefs/>
-</ds:datastoreItem>
 </file>
</xml_diff>

<commit_message>
Finished Phase 3 Report
</commit_message>
<xml_diff>
--- a/Phase 3/Pilot Study.docx
+++ b/Phase 3/Pilot Study.docx
@@ -498,7 +498,27 @@
           <w:lang w:val="en-GB"/>
           <w14:ligatures w14:val="standard"/>
         </w:rPr>
-        <w:t>We used the standard Linear Regression class from sklearn. In order ensure the best model accuracy and avoid overfitting, we used 10-fold cross validation on the dataset. After that, we used</w:t>
+        <w:t xml:space="preserve">We used the standard Linear Regression class from </w:t>
+      </w:r>
+      <w:proofErr w:type="spellStart"/>
+      <w:r>
+        <w:rPr>
+          <w:sz w:val="20"/>
+          <w:szCs w:val="20"/>
+          <w:lang w:val="en-GB"/>
+          <w14:ligatures w14:val="standard"/>
+        </w:rPr>
+        <w:t>sklearn</w:t>
+      </w:r>
+      <w:proofErr w:type="spellEnd"/>
+      <w:r>
+        <w:rPr>
+          <w:sz w:val="20"/>
+          <w:szCs w:val="20"/>
+          <w:lang w:val="en-GB"/>
+          <w14:ligatures w14:val="standard"/>
+        </w:rPr>
+        <w:t>. In order ensure the best model accuracy and avoid overfitting, we used 10-fold cross validation on the dataset. After that, we used</w:t>
       </w:r>
       <w:r>
         <w:rPr>
@@ -635,7 +655,25 @@
           <w:szCs w:val="20"/>
           <w14:ligatures w14:val="standard"/>
         </w:rPr>
-        <w:t xml:space="preserve">class from sklearn. 10-fold cross validation was also used to increase the reliability of the model and decrease overfitting. Unlike linear regression we used: </w:t>
+        <w:t xml:space="preserve">class from </w:t>
+      </w:r>
+      <w:proofErr w:type="spellStart"/>
+      <w:r>
+        <w:rPr>
+          <w:color w:val="auto"/>
+          <w:szCs w:val="20"/>
+          <w14:ligatures w14:val="standard"/>
+        </w:rPr>
+        <w:t>sklearn</w:t>
+      </w:r>
+      <w:proofErr w:type="spellEnd"/>
+      <w:r>
+        <w:rPr>
+          <w:color w:val="auto"/>
+          <w:szCs w:val="20"/>
+          <w14:ligatures w14:val="standard"/>
+        </w:rPr>
+        <w:t xml:space="preserve">. 10-fold cross validation was also used to increase the reliability of the model and decrease overfitting. Unlike linear regression we used: </w:t>
       </w:r>
       <w:r>
         <w:rPr>
@@ -900,7 +938,115 @@
           <w:szCs w:val="20"/>
           <w14:ligatures w14:val="standard"/>
         </w:rPr>
-        <w:t xml:space="preserve">We used the MLPClassifier of sklearn having a hidden layer of 4x10, an input layer which have nodes equal to the number of features, 1 output node, a max iteration count of 1000, the relu activation function and the adam solver. The relu activation function scales well with positive features, making the neural network more robust. 1000 max iterations ensures that the weights converge and a 4x10 hidden layer should introduce complex non-linear behaviour between the inputs and outputs. 10-fold cross validation </w:t>
+        <w:t xml:space="preserve">We used the </w:t>
+      </w:r>
+      <w:proofErr w:type="spellStart"/>
+      <w:r>
+        <w:rPr>
+          <w:color w:val="auto"/>
+          <w:szCs w:val="20"/>
+          <w14:ligatures w14:val="standard"/>
+        </w:rPr>
+        <w:t>MLPClassifier</w:t>
+      </w:r>
+      <w:proofErr w:type="spellEnd"/>
+      <w:r>
+        <w:rPr>
+          <w:color w:val="auto"/>
+          <w:szCs w:val="20"/>
+          <w14:ligatures w14:val="standard"/>
+        </w:rPr>
+        <w:t xml:space="preserve"> of </w:t>
+      </w:r>
+      <w:proofErr w:type="spellStart"/>
+      <w:r>
+        <w:rPr>
+          <w:color w:val="auto"/>
+          <w:szCs w:val="20"/>
+          <w14:ligatures w14:val="standard"/>
+        </w:rPr>
+        <w:t>sklearn</w:t>
+      </w:r>
+      <w:proofErr w:type="spellEnd"/>
+      <w:r>
+        <w:rPr>
+          <w:color w:val="auto"/>
+          <w:szCs w:val="20"/>
+          <w14:ligatures w14:val="standard"/>
+        </w:rPr>
+        <w:t xml:space="preserve"> having a hidden layer of 4x10, an input layer which have nodes equal to the number of features, 1 output node, a max iteration </w:t>
+      </w:r>
+      <w:proofErr w:type="gramStart"/>
+      <w:r>
+        <w:rPr>
+          <w:color w:val="auto"/>
+          <w:szCs w:val="20"/>
+          <w14:ligatures w14:val="standard"/>
+        </w:rPr>
+        <w:t>count</w:t>
+      </w:r>
+      <w:proofErr w:type="gramEnd"/>
+      <w:r>
+        <w:rPr>
+          <w:color w:val="auto"/>
+          <w:szCs w:val="20"/>
+          <w14:ligatures w14:val="standard"/>
+        </w:rPr>
+        <w:t xml:space="preserve"> of 1000, the </w:t>
+      </w:r>
+      <w:proofErr w:type="spellStart"/>
+      <w:r>
+        <w:rPr>
+          <w:color w:val="auto"/>
+          <w:szCs w:val="20"/>
+          <w14:ligatures w14:val="standard"/>
+        </w:rPr>
+        <w:t>relu</w:t>
+      </w:r>
+      <w:proofErr w:type="spellEnd"/>
+      <w:r>
+        <w:rPr>
+          <w:color w:val="auto"/>
+          <w:szCs w:val="20"/>
+          <w14:ligatures w14:val="standard"/>
+        </w:rPr>
+        <w:t xml:space="preserve"> activation function and the </w:t>
+      </w:r>
+      <w:proofErr w:type="spellStart"/>
+      <w:r>
+        <w:rPr>
+          <w:color w:val="auto"/>
+          <w:szCs w:val="20"/>
+          <w14:ligatures w14:val="standard"/>
+        </w:rPr>
+        <w:t>adam</w:t>
+      </w:r>
+      <w:proofErr w:type="spellEnd"/>
+      <w:r>
+        <w:rPr>
+          <w:color w:val="auto"/>
+          <w:szCs w:val="20"/>
+          <w14:ligatures w14:val="standard"/>
+        </w:rPr>
+        <w:t xml:space="preserve"> solver. The </w:t>
+      </w:r>
+      <w:proofErr w:type="spellStart"/>
+      <w:r>
+        <w:rPr>
+          <w:color w:val="auto"/>
+          <w:szCs w:val="20"/>
+          <w14:ligatures w14:val="standard"/>
+        </w:rPr>
+        <w:t>relu</w:t>
+      </w:r>
+      <w:proofErr w:type="spellEnd"/>
+      <w:r>
+        <w:rPr>
+          <w:color w:val="auto"/>
+          <w:szCs w:val="20"/>
+          <w14:ligatures w14:val="standard"/>
+        </w:rPr>
+        <w:t xml:space="preserve"> activation function scales well with positive features, making the neural network more robust. 1000 max iterations ensures that the weights converge and a 4x10 hidden layer should introduce complex non-linear behaviour between the inputs and outputs. 10-fold cross validation </w:t>
       </w:r>
       <w:r>
         <w:rPr>
@@ -1332,7 +1478,25 @@
           <w:szCs w:val="20"/>
           <w14:ligatures w14:val="standard"/>
         </w:rPr>
-        <w:t>We used the Gaussian Naïve Bayes classifier from sklearn. 10-fold cross validation was also used to increase the reliability of the model and decrease overfitting. The performance metrics are the same as the Logistic Regression and MLP.</w:t>
+        <w:t xml:space="preserve">We used the Gaussian Naïve Bayes classifier from </w:t>
+      </w:r>
+      <w:proofErr w:type="spellStart"/>
+      <w:r>
+        <w:rPr>
+          <w:color w:val="auto"/>
+          <w:szCs w:val="20"/>
+          <w14:ligatures w14:val="standard"/>
+        </w:rPr>
+        <w:t>sklearn</w:t>
+      </w:r>
+      <w:proofErr w:type="spellEnd"/>
+      <w:r>
+        <w:rPr>
+          <w:color w:val="auto"/>
+          <w:szCs w:val="20"/>
+          <w14:ligatures w14:val="standard"/>
+        </w:rPr>
+        <w:t>. 10-fold cross validation was also used to increase the reliability of the model and decrease overfitting. The performance metrics are the same as the Logistic Regression and MLP.</w:t>
       </w:r>
       <w:r>
         <w:rPr>
@@ -2106,7 +2270,23 @@
           <w:b w:val="0"/>
           <w:bCs w:val="0"/>
         </w:rPr>
-        <w:t xml:space="preserve">We use the KNeighborsClassifier from sklearn. </w:t>
+        <w:t xml:space="preserve">We use the </w:t>
+      </w:r>
+      <w:proofErr w:type="spellStart"/>
+      <w:r>
+        <w:rPr>
+          <w:b w:val="0"/>
+          <w:bCs w:val="0"/>
+        </w:rPr>
+        <w:t>KNeighborsClassifier</w:t>
+      </w:r>
+      <w:proofErr w:type="spellEnd"/>
+      <w:r>
+        <w:rPr>
+          <w:b w:val="0"/>
+          <w:bCs w:val="0"/>
+        </w:rPr>
+        <w:t xml:space="preserve"> from sklearn. </w:t>
       </w:r>
       <w:r>
         <w:rPr>
@@ -2622,7 +2802,23 @@
           <w:sz w:val="20"/>
           <w:szCs w:val="24"/>
         </w:rPr>
-        <w:t>We used the random forest classifier from sklearn with</w:t>
+        <w:t xml:space="preserve">We used the random forest classifier from </w:t>
+      </w:r>
+      <w:proofErr w:type="spellStart"/>
+      <w:r>
+        <w:rPr>
+          <w:sz w:val="20"/>
+          <w:szCs w:val="24"/>
+        </w:rPr>
+        <w:t>sklearn</w:t>
+      </w:r>
+      <w:proofErr w:type="spellEnd"/>
+      <w:r>
+        <w:rPr>
+          <w:sz w:val="20"/>
+          <w:szCs w:val="24"/>
+        </w:rPr>
+        <w:t xml:space="preserve"> with</w:t>
       </w:r>
       <w:r>
         <w:rPr>
@@ -2683,6 +2879,7 @@
       </w:pPr>
       <w:r>
         <w:rPr>
+          <w:noProof/>
           <w:lang w:val="en-US"/>
         </w:rPr>
         <w:drawing>
@@ -2769,76 +2966,140 @@
           <w:sz w:val="20"/>
           <w:szCs w:val="24"/>
         </w:rPr>
-        <w:t>the SVM classifier from sklearn and specifically used</w:t>
-      </w:r>
+        <w:t xml:space="preserve">the SVM classifier from </w:t>
+      </w:r>
+      <w:proofErr w:type="spellStart"/>
       <w:r>
         <w:rPr>
           <w:sz w:val="20"/>
           <w:szCs w:val="24"/>
         </w:rPr>
-        <w:t xml:space="preserve"> the rbf kernel. The linear kernel was used for a trial, but </w:t>
-      </w:r>
+        <w:t>sklearn</w:t>
+      </w:r>
+      <w:proofErr w:type="spellEnd"/>
       <w:r>
         <w:rPr>
           <w:sz w:val="20"/>
           <w:szCs w:val="24"/>
         </w:rPr>
-        <w:t>the run was so long</w:t>
+        <w:t xml:space="preserve"> and specifically used</w:t>
       </w:r>
       <w:r>
         <w:rPr>
           <w:sz w:val="20"/>
           <w:szCs w:val="24"/>
         </w:rPr>
-        <w:t xml:space="preserve"> that it was impractical. Therefore, we used the rbf kernel with</w:t>
-      </w:r>
+        <w:t xml:space="preserve"> the </w:t>
+      </w:r>
+      <w:proofErr w:type="spellStart"/>
       <w:r>
         <w:rPr>
           <w:sz w:val="20"/>
           <w:szCs w:val="24"/>
         </w:rPr>
-        <w:t xml:space="preserve"> 10-fold cross</w:t>
-      </w:r>
+        <w:t>rbf</w:t>
+      </w:r>
+      <w:proofErr w:type="spellEnd"/>
       <w:r>
         <w:rPr>
           <w:sz w:val="20"/>
           <w:szCs w:val="24"/>
         </w:rPr>
-        <w:t xml:space="preserve"> validation to increase the reliability of the results. The performance metrics are the same</w:t>
+        <w:t xml:space="preserve"> kernel. The linear kernel was used for a trial, but </w:t>
       </w:r>
       <w:r>
         <w:rPr>
           <w:sz w:val="20"/>
           <w:szCs w:val="24"/>
         </w:rPr>
-        <w:t xml:space="preserve"> as most models, but AUC is removed because turning the probability setting to true in the </w:t>
+        <w:t>the run was so long</w:t>
       </w:r>
       <w:r>
         <w:rPr>
           <w:sz w:val="20"/>
           <w:szCs w:val="24"/>
         </w:rPr>
-        <w:t>model takes way too much time.</w:t>
-      </w:r>
+        <w:t xml:space="preserve"> that it was impractical. Therefore, we used the </w:t>
+      </w:r>
+      <w:proofErr w:type="spellStart"/>
       <w:r>
         <w:rPr>
           <w:sz w:val="20"/>
           <w:szCs w:val="24"/>
         </w:rPr>
-        <w:t xml:space="preserve"> It has a higher than average precision with diabetics (but lower than average for non-diabetics)</w:t>
-      </w:r>
+        <w:t>rbf</w:t>
+      </w:r>
+      <w:proofErr w:type="spellEnd"/>
       <w:r>
         <w:rPr>
           <w:sz w:val="20"/>
           <w:szCs w:val="24"/>
         </w:rPr>
-        <w:t>. In contrast, the recall and F1-score for non-diabetics implies a level overfitting</w:t>
+        <w:t xml:space="preserve"> kernel with</w:t>
       </w:r>
       <w:r>
         <w:rPr>
           <w:sz w:val="20"/>
           <w:szCs w:val="24"/>
         </w:rPr>
+        <w:t xml:space="preserve"> 10-fold cross</w:t>
+      </w:r>
+      <w:r>
+        <w:rPr>
+          <w:sz w:val="20"/>
+          <w:szCs w:val="24"/>
+        </w:rPr>
+        <w:t xml:space="preserve"> validation to increase the reliability of the results. The performance metrics are the same</w:t>
+      </w:r>
+      <w:r>
+        <w:rPr>
+          <w:sz w:val="20"/>
+          <w:szCs w:val="24"/>
+        </w:rPr>
+        <w:t xml:space="preserve"> as most models, but AUC is removed because turning the probability setting to true in the </w:t>
+      </w:r>
+      <w:r>
+        <w:rPr>
+          <w:sz w:val="20"/>
+          <w:szCs w:val="24"/>
+        </w:rPr>
+        <w:t>model takes way too much time.</w:t>
+      </w:r>
+      <w:r>
+        <w:rPr>
+          <w:sz w:val="20"/>
+          <w:szCs w:val="24"/>
+        </w:rPr>
+        <w:t xml:space="preserve"> It has a </w:t>
+      </w:r>
+      <w:proofErr w:type="gramStart"/>
+      <w:r>
+        <w:rPr>
+          <w:sz w:val="20"/>
+          <w:szCs w:val="24"/>
+        </w:rPr>
+        <w:t>higher than average</w:t>
+      </w:r>
+      <w:proofErr w:type="gramEnd"/>
+      <w:r>
+        <w:rPr>
+          <w:sz w:val="20"/>
+          <w:szCs w:val="24"/>
+        </w:rPr>
+        <w:t xml:space="preserve"> precision with diabetics (but lower than average for non-diabetics)</w:t>
+      </w:r>
+      <w:r>
+        <w:rPr>
+          <w:sz w:val="20"/>
+          <w:szCs w:val="24"/>
+        </w:rPr>
+        <w:t>. In contrast, the recall and F1-score for non-diabetics implies a level overfitting</w:t>
+      </w:r>
+      <w:r>
+        <w:rPr>
+          <w:sz w:val="20"/>
+          <w:szCs w:val="24"/>
+        </w:rPr>
         <w:t xml:space="preserve"> with not enough diabetics being detected by the model.</w:t>
       </w:r>
     </w:p>
@@ -2852,12 +3113,13 @@
       </w:pPr>
       <w:r>
         <w:rPr>
+          <w:noProof/>
           <w:sz w:val="20"/>
           <w:szCs w:val="24"/>
         </w:rPr>
         <w:drawing>
-          <wp:inline distT="0" distB="0" distL="0" distR="0" wp14:anchorId="5399F011" wp14:editId="64E3E6BC">
-            <wp:extent cx="3048000" cy="878840"/>
+          <wp:inline distT="0" distB="0" distL="0" distR="0" wp14:anchorId="5399F011" wp14:editId="56FA2878">
+            <wp:extent cx="2863850" cy="878840"/>
             <wp:effectExtent l="0" t="0" r="0" b="0"/>
             <wp:docPr id="1559188133" name="Picture 1" descr="A screenshot of a graph&#10;&#10;AI-generated content may be incorrect."/>
             <wp:cNvGraphicFramePr>
@@ -2879,7 +3141,7 @@
                   <pic:spPr>
                     <a:xfrm>
                       <a:off x="0" y="0"/>
-                      <a:ext cx="3048000" cy="878840"/>
+                      <a:ext cx="2863850" cy="878840"/>
                     </a:xfrm>
                     <a:prstGeom prst="rect">
                       <a:avLst/>
@@ -2903,7 +3165,7 @@
         <w:t xml:space="preserve">Figure </w:t>
       </w:r>
       <w:r>
-        <w:t>19</w:t>
+        <w:t>20</w:t>
       </w:r>
     </w:p>
     <w:p>
@@ -2915,6 +3177,458 @@
         </w:rPr>
       </w:pPr>
     </w:p>
+    <w:p>
+      <w:pPr>
+        <w:pStyle w:val="ListParagraph"/>
+      </w:pPr>
+      <w:r>
+        <w:t>Ensemble Classifier (Adaboost)</w:t>
+      </w:r>
+    </w:p>
+    <w:p>
+      <w:pPr>
+        <w:pStyle w:val="ListParagraph"/>
+        <w:numPr>
+          <w:ilvl w:val="0"/>
+          <w:numId w:val="0"/>
+        </w:numPr>
+        <w:ind w:left="720"/>
+      </w:pPr>
+    </w:p>
+    <w:p>
+      <w:pPr>
+        <w:pStyle w:val="ListParagraph"/>
+        <w:numPr>
+          <w:ilvl w:val="0"/>
+          <w:numId w:val="0"/>
+        </w:numPr>
+        <w:ind w:left="720"/>
+        <w:rPr>
+          <w:b w:val="0"/>
+          <w:bCs w:val="0"/>
+        </w:rPr>
+      </w:pPr>
+      <w:r>
+        <w:rPr>
+          <w:b w:val="0"/>
+          <w:bCs w:val="0"/>
+        </w:rPr>
+        <w:t xml:space="preserve">We used the AdaboostClassifier from sklearn with a Logistic Regression estimator. 10-fold cross validation was used as usual </w:t>
+      </w:r>
+      <w:r>
+        <w:rPr>
+          <w:b w:val="0"/>
+          <w:bCs w:val="0"/>
+        </w:rPr>
+        <w:t>with the same performance metrics.</w:t>
+      </w:r>
+      <w:r>
+        <w:rPr>
+          <w:b w:val="0"/>
+          <w:bCs w:val="0"/>
+        </w:rPr>
+        <w:t xml:space="preserve"> </w:t>
+      </w:r>
+      <w:proofErr w:type="spellStart"/>
+      <w:r>
+        <w:rPr>
+          <w:b w:val="0"/>
+          <w:bCs w:val="0"/>
+        </w:rPr>
+        <w:t>n_estimators</w:t>
+      </w:r>
+      <w:proofErr w:type="spellEnd"/>
+      <w:r>
+        <w:rPr>
+          <w:b w:val="0"/>
+          <w:bCs w:val="0"/>
+        </w:rPr>
+        <w:t xml:space="preserve"> = 50.</w:t>
+      </w:r>
+      <w:r>
+        <w:rPr>
+          <w:b w:val="0"/>
+          <w:bCs w:val="0"/>
+        </w:rPr>
+        <w:t xml:space="preserve"> Here are the results:</w:t>
+      </w:r>
+    </w:p>
+    <w:p>
+      <w:pPr>
+        <w:pStyle w:val="ListParagraph"/>
+        <w:numPr>
+          <w:ilvl w:val="0"/>
+          <w:numId w:val="0"/>
+        </w:numPr>
+        <w:ind w:left="720"/>
+        <w:rPr>
+          <w:b w:val="0"/>
+          <w:bCs w:val="0"/>
+        </w:rPr>
+      </w:pPr>
+    </w:p>
+    <w:p>
+      <w:pPr>
+        <w:keepNext/>
+        <w:ind w:left="720" w:hanging="360"/>
+      </w:pPr>
+      <w:r>
+        <w:drawing>
+          <wp:inline distT="0" distB="0" distL="0" distR="0" wp14:anchorId="0EBCC188" wp14:editId="38F16B12">
+            <wp:extent cx="2961640" cy="789940"/>
+            <wp:effectExtent l="0" t="0" r="0" b="0"/>
+            <wp:docPr id="1898500276" name="Picture 1"/>
+            <wp:cNvGraphicFramePr>
+              <a:graphicFrameLocks xmlns:a="http://schemas.openxmlformats.org/drawingml/2006/main" noChangeAspect="1"/>
+            </wp:cNvGraphicFramePr>
+            <a:graphic xmlns:a="http://schemas.openxmlformats.org/drawingml/2006/main">
+              <a:graphicData uri="http://schemas.openxmlformats.org/drawingml/2006/picture">
+                <pic:pic xmlns:pic="http://schemas.openxmlformats.org/drawingml/2006/picture">
+                  <pic:nvPicPr>
+                    <pic:cNvPr id="1898500276" name=""/>
+                    <pic:cNvPicPr/>
+                  </pic:nvPicPr>
+                  <pic:blipFill>
+                    <a:blip r:embed="rId33"/>
+                    <a:stretch>
+                      <a:fillRect/>
+                    </a:stretch>
+                  </pic:blipFill>
+                  <pic:spPr>
+                    <a:xfrm>
+                      <a:off x="0" y="0"/>
+                      <a:ext cx="2961640" cy="789940"/>
+                    </a:xfrm>
+                    <a:prstGeom prst="rect">
+                      <a:avLst/>
+                    </a:prstGeom>
+                  </pic:spPr>
+                </pic:pic>
+              </a:graphicData>
+            </a:graphic>
+          </wp:inline>
+        </w:drawing>
+      </w:r>
+    </w:p>
+    <w:p>
+      <w:pPr>
+        <w:pStyle w:val="Caption"/>
+      </w:pPr>
+      <w:r>
+        <w:t>Figure 21</w:t>
+      </w:r>
+    </w:p>
+    <w:p/>
+    <w:p>
+      <w:r>
+        <w:t>From Figure 21, This model also suffers from being overly cautious</w:t>
+      </w:r>
+      <w:r>
+        <w:t>. It is very similar to other models. Nothing special.</w:t>
+      </w:r>
+    </w:p>
+    <w:p/>
+    <w:p>
+      <w:pPr>
+        <w:pStyle w:val="ListParagraph"/>
+      </w:pPr>
+      <w:r>
+        <w:t>Ensemble Classifier (Gradboost)</w:t>
+      </w:r>
+    </w:p>
+    <w:p>
+      <w:pPr>
+        <w:pStyle w:val="ListParagraph"/>
+        <w:numPr>
+          <w:ilvl w:val="0"/>
+          <w:numId w:val="0"/>
+        </w:numPr>
+        <w:ind w:left="720"/>
+      </w:pPr>
+    </w:p>
+    <w:p>
+      <w:pPr>
+        <w:pStyle w:val="ListParagraph"/>
+        <w:numPr>
+          <w:ilvl w:val="0"/>
+          <w:numId w:val="0"/>
+        </w:numPr>
+        <w:ind w:left="720"/>
+        <w:rPr>
+          <w:b w:val="0"/>
+          <w:bCs w:val="0"/>
+        </w:rPr>
+      </w:pPr>
+      <w:r>
+        <w:rPr>
+          <w:b w:val="0"/>
+          <w:bCs w:val="0"/>
+        </w:rPr>
+        <w:t xml:space="preserve">We used the GradientBoostingClassifier from sklearn. Parameters are: </w:t>
+      </w:r>
+      <w:proofErr w:type="spellStart"/>
+      <w:r>
+        <w:rPr>
+          <w:b w:val="0"/>
+          <w:bCs w:val="0"/>
+        </w:rPr>
+        <w:t>n_estimators</w:t>
+      </w:r>
+      <w:proofErr w:type="spellEnd"/>
+      <w:r>
+        <w:rPr>
+          <w:b w:val="0"/>
+          <w:bCs w:val="0"/>
+        </w:rPr>
+        <w:t xml:space="preserve"> = 100, </w:t>
+      </w:r>
+      <w:proofErr w:type="spellStart"/>
+      <w:r>
+        <w:rPr>
+          <w:b w:val="0"/>
+          <w:bCs w:val="0"/>
+        </w:rPr>
+        <w:t>learning_rate</w:t>
+      </w:r>
+      <w:proofErr w:type="spellEnd"/>
+      <w:r>
+        <w:rPr>
+          <w:b w:val="0"/>
+          <w:bCs w:val="0"/>
+        </w:rPr>
+        <w:t xml:space="preserve"> = 1, </w:t>
+      </w:r>
+      <w:proofErr w:type="spellStart"/>
+      <w:r>
+        <w:rPr>
+          <w:b w:val="0"/>
+          <w:bCs w:val="0"/>
+        </w:rPr>
+        <w:t>max_depth</w:t>
+      </w:r>
+      <w:proofErr w:type="spellEnd"/>
+      <w:r>
+        <w:rPr>
+          <w:b w:val="0"/>
+          <w:bCs w:val="0"/>
+        </w:rPr>
+        <w:t xml:space="preserve">=1 and </w:t>
+      </w:r>
+      <w:proofErr w:type="spellStart"/>
+      <w:r>
+        <w:rPr>
+          <w:b w:val="0"/>
+          <w:bCs w:val="0"/>
+        </w:rPr>
+        <w:t>random_state</w:t>
+      </w:r>
+      <w:proofErr w:type="spellEnd"/>
+      <w:r>
+        <w:rPr>
+          <w:b w:val="0"/>
+          <w:bCs w:val="0"/>
+        </w:rPr>
+        <w:t xml:space="preserve"> = 0. </w:t>
+      </w:r>
+      <w:r>
+        <w:rPr>
+          <w:b w:val="0"/>
+          <w:bCs w:val="0"/>
+        </w:rPr>
+        <w:t>10-fold cross validation was used as usual with the same performance metrics</w:t>
+      </w:r>
+      <w:r>
+        <w:rPr>
+          <w:b w:val="0"/>
+          <w:bCs w:val="0"/>
+        </w:rPr>
+        <w:t xml:space="preserve">. Here are the results. </w:t>
+      </w:r>
+    </w:p>
+    <w:p>
+      <w:pPr>
+        <w:keepNext/>
+        <w:ind w:left="720" w:hanging="360"/>
+      </w:pPr>
+      <w:r>
+        <w:drawing>
+          <wp:inline distT="0" distB="0" distL="0" distR="0" wp14:anchorId="246871B7" wp14:editId="1144933E">
+            <wp:extent cx="3048000" cy="758190"/>
+            <wp:effectExtent l="0" t="0" r="0" b="3810"/>
+            <wp:docPr id="62073711" name="Picture 1"/>
+            <wp:cNvGraphicFramePr>
+              <a:graphicFrameLocks xmlns:a="http://schemas.openxmlformats.org/drawingml/2006/main" noChangeAspect="1"/>
+            </wp:cNvGraphicFramePr>
+            <a:graphic xmlns:a="http://schemas.openxmlformats.org/drawingml/2006/main">
+              <a:graphicData uri="http://schemas.openxmlformats.org/drawingml/2006/picture">
+                <pic:pic xmlns:pic="http://schemas.openxmlformats.org/drawingml/2006/picture">
+                  <pic:nvPicPr>
+                    <pic:cNvPr id="62073711" name=""/>
+                    <pic:cNvPicPr/>
+                  </pic:nvPicPr>
+                  <pic:blipFill>
+                    <a:blip r:embed="rId34"/>
+                    <a:stretch>
+                      <a:fillRect/>
+                    </a:stretch>
+                  </pic:blipFill>
+                  <pic:spPr>
+                    <a:xfrm>
+                      <a:off x="0" y="0"/>
+                      <a:ext cx="3048000" cy="758190"/>
+                    </a:xfrm>
+                    <a:prstGeom prst="rect">
+                      <a:avLst/>
+                    </a:prstGeom>
+                  </pic:spPr>
+                </pic:pic>
+              </a:graphicData>
+            </a:graphic>
+          </wp:inline>
+        </w:drawing>
+      </w:r>
+    </w:p>
+    <w:p>
+      <w:pPr>
+        <w:pStyle w:val="Caption"/>
+      </w:pPr>
+      <w:r>
+        <w:t>Figure 22</w:t>
+      </w:r>
+    </w:p>
+    <w:p/>
+    <w:p>
+      <w:r>
+        <w:t>This model did better than Adaboost. This is shown by the different F1 measures for Diabetes 2.</w:t>
+      </w:r>
+    </w:p>
+    <w:p/>
+    <w:p>
+      <w:pPr>
+        <w:rPr>
+          <w:b/>
+          <w:bCs/>
+          <w:sz w:val="22"/>
+        </w:rPr>
+      </w:pPr>
+      <w:r>
+        <w:rPr>
+          <w:b/>
+          <w:bCs/>
+          <w:sz w:val="22"/>
+        </w:rPr>
+        <w:t>TOP 3 MODELS</w:t>
+      </w:r>
+    </w:p>
+    <w:p>
+      <w:pPr>
+        <w:rPr>
+          <w:b/>
+          <w:bCs/>
+          <w:sz w:val="22"/>
+        </w:rPr>
+      </w:pPr>
+    </w:p>
+    <w:p>
+      <w:pPr>
+        <w:rPr>
+          <w:sz w:val="20"/>
+          <w:szCs w:val="20"/>
+        </w:rPr>
+      </w:pPr>
+      <w:r>
+        <w:rPr>
+          <w:sz w:val="20"/>
+          <w:szCs w:val="20"/>
+        </w:rPr>
+        <w:t>From analysing the performances of each model, by comparing the F1 scores of them, we arrive at the best 3 models, which are:</w:t>
+      </w:r>
+    </w:p>
+    <w:p>
+      <w:pPr>
+        <w:pStyle w:val="ListParagraph"/>
+        <w:numPr>
+          <w:ilvl w:val="0"/>
+          <w:numId w:val="33"/>
+        </w:numPr>
+      </w:pPr>
+      <w:r>
+        <w:t>Naïve Bayes</w:t>
+      </w:r>
+    </w:p>
+    <w:p>
+      <w:pPr>
+        <w:pStyle w:val="ListParagraph"/>
+        <w:numPr>
+          <w:ilvl w:val="0"/>
+          <w:numId w:val="33"/>
+        </w:numPr>
+      </w:pPr>
+      <w:r>
+        <w:t>Logistic Regression</w:t>
+      </w:r>
+    </w:p>
+    <w:p>
+      <w:pPr>
+        <w:pStyle w:val="ListParagraph"/>
+        <w:numPr>
+          <w:ilvl w:val="0"/>
+          <w:numId w:val="33"/>
+        </w:numPr>
+      </w:pPr>
+      <w:r>
+        <w:t>Grad Boost</w:t>
+      </w:r>
+    </w:p>
+    <w:p/>
+    <w:p>
+      <w:pPr>
+        <w:rPr>
+          <w:sz w:val="20"/>
+          <w:szCs w:val="20"/>
+        </w:rPr>
+      </w:pPr>
+      <w:r>
+        <w:rPr>
+          <w:sz w:val="20"/>
+          <w:szCs w:val="20"/>
+        </w:rPr>
+        <w:t xml:space="preserve">Naïve Bayes had the recall out of the bunch, which is pretty good because false negatives are much more severe than false positives. This also made it have the best F1 score out of the models. It also had decent AUC and accuracy. </w:t>
+      </w:r>
+      <w:r>
+        <w:rPr>
+          <w:sz w:val="20"/>
+          <w:szCs w:val="20"/>
+        </w:rPr>
+        <w:t>Logistic Regression and GradBoost are interchangeable in terms of ranking. Even though the decision tree model had a higher F1 score, its AUC was very close to 0.5, making it very worthless. Logistic and GradBoost provide a decent F1 score with a pretty good accuracy and AUC values, making them quite valuable.</w:t>
+      </w:r>
+    </w:p>
+    <w:p/>
+    <w:p/>
+    <w:p>
+      <w:r>
+        <w:t xml:space="preserve">In conclusion, </w:t>
+      </w:r>
+      <w:r>
+        <w:t xml:space="preserve">the </w:t>
+      </w:r>
+      <w:r>
+        <w:rPr>
+          <w:b/>
+          <w:bCs/>
+        </w:rPr>
+        <w:t>Naïve Bayes</w:t>
+      </w:r>
+      <w:r>
+        <w:t xml:space="preserve"> model offers the best overall performance without many compromises, making it an excellent pick for out final machine learning model.</w:t>
+      </w:r>
+    </w:p>
+    <w:p>
+      <w:pPr>
+        <w:ind w:left="360"/>
+      </w:pPr>
+    </w:p>
+    <w:p/>
     <w:sectPr>
       <w:endnotePr>
         <w:numFmt w:val="decimal"/>
@@ -3045,7 +3759,7 @@
             <w:rPr>
               <w:rFonts w:ascii="Linux Biolinum" w:hAnsi="Linux Biolinum" w:cs="Linux Biolinum"/>
             </w:rPr>
-            <w:t>Literature Review on Diabetes Detection using Machine Learning</w:t>
+            <w:t>Pilot Study</w:t>
           </w:r>
         </w:p>
       </w:tc>
@@ -3129,7 +3843,7 @@
             <w:rPr>
               <w:rFonts w:ascii="Linux Biolinum" w:hAnsi="Linux Biolinum" w:cs="Linux Biolinum"/>
             </w:rPr>
-            <w:t>Literature Review on Diabetes Detection using Machine Learning</w:t>
+            <w:t>Pilot Study</w:t>
           </w:r>
         </w:p>
       </w:tc>
@@ -5443,6 +6157,95 @@
     </w:lvl>
   </w:abstractNum>
   <w:abstractNum w:abstractNumId="30" w15:restartNumberingAfterBreak="0">
+    <w:nsid w:val="7D4E7FCE"/>
+    <w:multiLevelType w:val="hybridMultilevel"/>
+    <w:tmpl w:val="F58A60A2"/>
+    <w:lvl w:ilvl="0" w:tplc="3CBA2EF0">
+      <w:start w:val="1"/>
+      <w:numFmt w:val="decimal"/>
+      <w:lvlText w:val="%1-"/>
+      <w:lvlJc w:val="left"/>
+      <w:pPr>
+        <w:ind w:left="720" w:hanging="360"/>
+      </w:pPr>
+      <w:rPr>
+        <w:rFonts w:hint="default"/>
+      </w:rPr>
+    </w:lvl>
+    <w:lvl w:ilvl="1" w:tplc="08090019" w:tentative="1">
+      <w:start w:val="1"/>
+      <w:numFmt w:val="lowerLetter"/>
+      <w:lvlText w:val="%2."/>
+      <w:lvlJc w:val="left"/>
+      <w:pPr>
+        <w:ind w:left="1440" w:hanging="360"/>
+      </w:pPr>
+    </w:lvl>
+    <w:lvl w:ilvl="2" w:tplc="0809001B" w:tentative="1">
+      <w:start w:val="1"/>
+      <w:numFmt w:val="lowerRoman"/>
+      <w:lvlText w:val="%3."/>
+      <w:lvlJc w:val="right"/>
+      <w:pPr>
+        <w:ind w:left="2160" w:hanging="180"/>
+      </w:pPr>
+    </w:lvl>
+    <w:lvl w:ilvl="3" w:tplc="0809000F" w:tentative="1">
+      <w:start w:val="1"/>
+      <w:numFmt w:val="decimal"/>
+      <w:lvlText w:val="%4."/>
+      <w:lvlJc w:val="left"/>
+      <w:pPr>
+        <w:ind w:left="2880" w:hanging="360"/>
+      </w:pPr>
+    </w:lvl>
+    <w:lvl w:ilvl="4" w:tplc="08090019" w:tentative="1">
+      <w:start w:val="1"/>
+      <w:numFmt w:val="lowerLetter"/>
+      <w:lvlText w:val="%5."/>
+      <w:lvlJc w:val="left"/>
+      <w:pPr>
+        <w:ind w:left="3600" w:hanging="360"/>
+      </w:pPr>
+    </w:lvl>
+    <w:lvl w:ilvl="5" w:tplc="0809001B" w:tentative="1">
+      <w:start w:val="1"/>
+      <w:numFmt w:val="lowerRoman"/>
+      <w:lvlText w:val="%6."/>
+      <w:lvlJc w:val="right"/>
+      <w:pPr>
+        <w:ind w:left="4320" w:hanging="180"/>
+      </w:pPr>
+    </w:lvl>
+    <w:lvl w:ilvl="6" w:tplc="0809000F" w:tentative="1">
+      <w:start w:val="1"/>
+      <w:numFmt w:val="decimal"/>
+      <w:lvlText w:val="%7."/>
+      <w:lvlJc w:val="left"/>
+      <w:pPr>
+        <w:ind w:left="5040" w:hanging="360"/>
+      </w:pPr>
+    </w:lvl>
+    <w:lvl w:ilvl="7" w:tplc="08090019" w:tentative="1">
+      <w:start w:val="1"/>
+      <w:numFmt w:val="lowerLetter"/>
+      <w:lvlText w:val="%8."/>
+      <w:lvlJc w:val="left"/>
+      <w:pPr>
+        <w:ind w:left="5760" w:hanging="360"/>
+      </w:pPr>
+    </w:lvl>
+    <w:lvl w:ilvl="8" w:tplc="0809001B" w:tentative="1">
+      <w:start w:val="1"/>
+      <w:numFmt w:val="lowerRoman"/>
+      <w:lvlText w:val="%9."/>
+      <w:lvlJc w:val="right"/>
+      <w:pPr>
+        <w:ind w:left="6480" w:hanging="180"/>
+      </w:pPr>
+    </w:lvl>
+  </w:abstractNum>
+  <w:abstractNum w:abstractNumId="31" w15:restartNumberingAfterBreak="0">
     <w:nsid w:val="7E7B01F4"/>
     <w:multiLevelType w:val="hybridMultilevel"/>
     <w:tmpl w:val="4EF20644"/>
@@ -5618,7 +6421,7 @@
     <w:abstractNumId w:val="23"/>
   </w:num>
   <w:num w:numId="22" w16cid:durableId="1193179935">
-    <w:abstractNumId w:val="30"/>
+    <w:abstractNumId w:val="31"/>
   </w:num>
   <w:num w:numId="23" w16cid:durableId="1777558007">
     <w:abstractNumId w:val="13"/>
@@ -5701,6 +6504,9 @@
   </w:num>
   <w:num w:numId="32" w16cid:durableId="94139057">
     <w:abstractNumId w:val="26"/>
+  </w:num>
+  <w:num w:numId="33" w16cid:durableId="318465014">
+    <w:abstractNumId w:val="30"/>
   </w:num>
   <w:numIdMacAtCleanup w:val="22"/>
 </w:numbering>
@@ -8428,7 +9234,7 @@
     <w:unhideWhenUsed/>
     <w:qFormat/>
     <w:locked/>
-    <w:rsid w:val="00DD13F5"/>
+    <w:rsid w:val="008C40D8"/>
     <w:pPr>
       <w:jc w:val="center"/>
     </w:pPr>
@@ -11819,6 +12625,10 @@
 </file>
 
 <file path=customXml/item1.xml><?xml version="1.0" encoding="utf-8"?>
+<b:Sources xmlns:b="http://schemas.openxmlformats.org/officeDocument/2006/bibliography" xmlns="http://schemas.openxmlformats.org/officeDocument/2006/bibliography" SelectedStyle="\APA.XSL" StyleName="APA"/>
+</file>
+
+<file path=customXml/item2.xml><?xml version="1.0" encoding="utf-8"?>
 <Workflow version="v.1.13">
   <Filtration versionrequired="True" status="DONE" StartTime="25-07-2014 13:27:04" EndTime="25-07-2014 13:28:29">
     <Mandatory>
@@ -11996,20 +12806,16 @@
 </Workflow>
 </file>
 
-<file path=customXml/item2.xml><?xml version="1.0" encoding="utf-8"?>
-<b:Sources xmlns:b="http://schemas.openxmlformats.org/officeDocument/2006/bibliography" xmlns="http://schemas.openxmlformats.org/officeDocument/2006/bibliography" SelectedStyle="\APA.XSL" StyleName="APA"/>
-</file>
-
 <file path=customXml/itemProps1.xml><?xml version="1.0" encoding="utf-8"?>
-<ds:datastoreItem xmlns:ds="http://schemas.openxmlformats.org/officeDocument/2006/customXml" ds:itemID="{4D45DBA2-DCF6-46BF-858B-9A8CC8161B4D}">
-  <ds:schemaRefs/>
-</ds:datastoreItem>
-</file>
-
-<file path=customXml/itemProps2.xml><?xml version="1.0" encoding="utf-8"?>
 <ds:datastoreItem xmlns:ds="http://schemas.openxmlformats.org/officeDocument/2006/customXml" ds:itemID="{B589180B-96F4-4B3D-93D7-E2C64345EF74}">
   <ds:schemaRefs>
     <ds:schemaRef ds:uri="http://schemas.openxmlformats.org/officeDocument/2006/bibliography"/>
   </ds:schemaRefs>
 </ds:datastoreItem>
+</file>
+
+<file path=customXml/itemProps2.xml><?xml version="1.0" encoding="utf-8"?>
+<ds:datastoreItem xmlns:ds="http://schemas.openxmlformats.org/officeDocument/2006/customXml" ds:itemID="{4D45DBA2-DCF6-46BF-858B-9A8CC8161B4D}">
+  <ds:schemaRefs/>
+</ds:datastoreItem>
 </file>
</xml_diff>